<commit_message>
Teams of at most 5, 10-minute demo slots, repository from template (no fork), shared team list; outputs rebuilt
</commit_message>
<xml_diff>
--- a/docs/prerequisites/cen207-prerequisites-notes.en.docx
+++ b/docs/prerequisites/cen207-prerequisites-notes.en.docx
@@ -385,7 +385,7 @@
               <w:t xml:space="preserve"> </w:t>
             </w:r>
             <w:r>
-              <w:t xml:space="preserve">(fork, plan, submission) for both the midterm and the final checkpoint</w:t>
+              <w:t xml:space="preserve">(repository from the template, plan, submission) for both the midterm and the final checkpoint</w:t>
             </w:r>
           </w:p>
         </w:tc>
@@ -458,7 +458,13 @@
               <w:t xml:space="preserve"> </w:t>
             </w:r>
             <w:r>
-              <w:t xml:space="preserve">forking a template, building it, producing its tests and documentation</w:t>
+              <w:t xml:space="preserve">creating a private repository from a template (</w:t>
+            </w:r>
+            <w:r>
+              <w:t xml:space="preserve">“Use this template”</w:t>
+            </w:r>
+            <w:r>
+              <w:t xml:space="preserve">, not fork), building it, producing its tests and documentation</w:t>
             </w:r>
           </w:p>
         </w:tc>

</xml_diff>